<commit_message>
Updated data dictionary and directory names
</commit_message>
<xml_diff>
--- a/Model_Outputs/Tables/Table1.docx
+++ b/Model_Outputs/Tables/Table1.docx
@@ -837,7 +837,7 @@
                 <w:szCs w:val="22"/>
                 <w:color w:val="000000"/>
               </w:rPr>
-              <w:t xml:space="preserve">21.2 (17.5)</w:t>
+              <w:t xml:space="preserve">20.9 (17.6)</w:t>
             </w:r>
           </w:p>
         </w:tc>
@@ -1107,7 +1107,7 @@
                 <w:szCs w:val="22"/>
                 <w:color w:val="000000"/>
               </w:rPr>
-              <w:t xml:space="preserve">18.6 (16.5)</w:t>
+              <w:t xml:space="preserve">18.5 (16.5)</w:t>
             </w:r>
           </w:p>
         </w:tc>

</xml_diff>